<commit_message>
updated template and code
</commit_message>
<xml_diff>
--- a/Plutus Design Documentation.docx
+++ b/Plutus Design Documentation.docx
@@ -534,18 +534,35 @@
     </w:p>
     <w:p>
       <w:r>
+        <w:t>8/4/2026 (1</w:t>
+      </w:r>
+      <w:r>
+        <w:rPr>
+          <w:vertAlign w:val="superscript"/>
+        </w:rPr>
+        <w:t>st</w:t>
+      </w:r>
+      <w:r>
+        <w:t xml:space="preserve"> day)</w:t>
+      </w:r>
+    </w:p>
+    <w:p>
+      <w:r>
         <w:t xml:space="preserve">After setting up this documentation and outline some basic requirements, I have just hit a first roadblock that is creating a useful and non-gimmick design. I </w:t>
       </w:r>
-      <w:proofErr w:type="gramStart"/>
-      <w:r>
-        <w:t>have to</w:t>
-      </w:r>
-      <w:proofErr w:type="gramEnd"/>
+      <w:r>
+        <w:t>must</w:t>
+      </w:r>
       <w:r>
         <w:t xml:space="preserve"> think of what should present in the app and how I would do it.</w:t>
       </w:r>
     </w:p>
     <w:p>
+      <w:pPr>
+        <w:rPr>
+          <w:lang w:val="en-US"/>
+        </w:rPr>
+      </w:pPr>
       <w:r>
         <w:t xml:space="preserve">The idea is I would create something simple first in plain HTML before migrating it to a component-based framework. At this point, I am not sure what tech stack should </w:t>
       </w:r>
@@ -557,11 +574,9 @@
       <w:r>
         <w:t xml:space="preserve"> be. Regardless, I </w:t>
       </w:r>
-      <w:proofErr w:type="gramStart"/>
-      <w:r>
-        <w:t>have to</w:t>
-      </w:r>
-      <w:proofErr w:type="gramEnd"/>
+      <w:r>
+        <w:t>must</w:t>
+      </w:r>
       <w:r>
         <w:t xml:space="preserve"> come up with a design.</w:t>
       </w:r>

</xml_diff>

<commit_message>
added ER model documentation and planning
</commit_message>
<xml_diff>
--- a/Plutus Design Documentation.docx
+++ b/Plutus Design Documentation.docx
@@ -135,13 +135,7 @@
         <w:rPr>
           <w:lang w:val="en-US"/>
         </w:rPr>
-        <w:t xml:space="preserve"> </w:t>
-      </w:r>
-      <w:r>
-        <w:rPr>
-          <w:lang w:val="en-US"/>
-        </w:rPr>
-        <w:t>giabaotran@cmail.carleton.ca</w:t>
+        <w:t xml:space="preserve"> giabaotran@cmail.carleton.ca</w:t>
       </w:r>
     </w:p>
     <w:p>
@@ -275,22 +269,8 @@
       </w:r>
     </w:p>
     <w:p>
-      <w:proofErr w:type="gramStart"/>
-      <w:r>
-        <w:t>So</w:t>
-      </w:r>
-      <w:proofErr w:type="gramEnd"/>
-      <w:r>
-        <w:t xml:space="preserve"> I came up with </w:t>
-      </w:r>
-      <w:r>
-        <w:t>Plutus</w:t>
-      </w:r>
-      <w:r>
-        <w:t xml:space="preserve">, it is </w:t>
-      </w:r>
-      <w:r>
-        <w:t>created to bridge this gap by offering a simple, accessible, and insightful platform that transforms raw financial data into useful information, helping users better understand and manage their finances.</w:t>
+      <w:r>
+        <w:t>So I came up with Plutus, it is created to bridge this gap by offering a simple, accessible, and insightful platform that transforms raw financial data into useful information, helping users better understand and manage their finances.</w:t>
       </w:r>
     </w:p>
     <w:p>
@@ -327,16 +307,11 @@
     </w:p>
     <w:p>
       <w:r>
-        <w:t xml:space="preserve">Thank you for your interest in </w:t>
-      </w:r>
-      <w:proofErr w:type="gramStart"/>
-      <w:r>
-        <w:t>Plutus</w:t>
+        <w:t>Thank you for your interest in Plutus</w:t>
       </w:r>
       <w:r>
         <w:t xml:space="preserve"> !!!</w:t>
       </w:r>
-      <w:proofErr w:type="gramEnd"/>
     </w:p>
     <w:p>
       <w:r>
@@ -372,10 +347,7 @@
         </w:numPr>
       </w:pPr>
       <w:r>
-        <w:t>Users are</w:t>
-      </w:r>
-      <w:r>
-        <w:t xml:space="preserve"> to see their past transactions (spending &amp; income)</w:t>
+        <w:t>Outgoing or Ingoing Transactions can be added for a User</w:t>
       </w:r>
     </w:p>
     <w:p>
@@ -387,10 +359,7 @@
         </w:numPr>
       </w:pPr>
       <w:r>
-        <w:t>Users are</w:t>
-      </w:r>
-      <w:r>
-        <w:t xml:space="preserve"> to import and export transactions in csv</w:t>
+        <w:t>Assets can be added either through a transaction or just simply added. For example: an inherit asset is not a transaction or a long ago purchase that users don’t remember</w:t>
       </w:r>
     </w:p>
     <w:p>
@@ -405,24 +374,7 @@
         <w:t>Users are</w:t>
       </w:r>
       <w:r>
-        <w:t xml:space="preserve"> to create a financial goal (</w:t>
-      </w:r>
-      <w:proofErr w:type="spellStart"/>
-      <w:r>
-        <w:t>e.g</w:t>
-      </w:r>
-      <w:proofErr w:type="spellEnd"/>
-      <w:r>
-        <w:t>, buying a new phone,</w:t>
-      </w:r>
-      <w:r>
-        <w:t xml:space="preserve"> a trip to JP</w:t>
-      </w:r>
-      <w:r>
-        <w:t>)</w:t>
-      </w:r>
-      <w:r>
-        <w:t>.</w:t>
+        <w:t xml:space="preserve"> to see their past transactions (spending &amp; income)</w:t>
       </w:r>
     </w:p>
     <w:p>
@@ -434,13 +386,10 @@
         </w:numPr>
       </w:pPr>
       <w:r>
-        <w:t xml:space="preserve">Users are to </w:t>
-      </w:r>
-      <w:r>
-        <w:t xml:space="preserve">receive recommendation </w:t>
-      </w:r>
-      <w:r>
-        <w:t>to reach their goals.</w:t>
+        <w:t>Users are</w:t>
+      </w:r>
+      <w:r>
+        <w:t xml:space="preserve"> to import and export transactions in csv</w:t>
       </w:r>
     </w:p>
     <w:p>
@@ -452,10 +401,19 @@
         </w:numPr>
       </w:pPr>
       <w:r>
-        <w:t>Users are to have i</w:t>
-      </w:r>
-      <w:r>
-        <w:t>ncome &amp; spending forecast.</w:t>
+        <w:t>Users are</w:t>
+      </w:r>
+      <w:r>
+        <w:t xml:space="preserve"> to create a financial goal (e.g, buying a new phone,</w:t>
+      </w:r>
+      <w:r>
+        <w:t xml:space="preserve"> a trip to JP</w:t>
+      </w:r>
+      <w:r>
+        <w:t>)</w:t>
+      </w:r>
+      <w:r>
+        <w:t>.</w:t>
       </w:r>
     </w:p>
     <w:p>
@@ -467,16 +425,10 @@
         </w:numPr>
       </w:pPr>
       <w:r>
-        <w:t xml:space="preserve">Users are to be sent </w:t>
-      </w:r>
-      <w:r>
-        <w:t>notifications</w:t>
-      </w:r>
-      <w:r>
-        <w:t xml:space="preserve"> if there is</w:t>
-      </w:r>
-      <w:r>
-        <w:t xml:space="preserve"> sudden spike in spendings.</w:t>
+        <w:t xml:space="preserve">Users are to receive recommendation </w:t>
+      </w:r>
+      <w:r>
+        <w:t>to reach their goals.</w:t>
       </w:r>
     </w:p>
     <w:p>
@@ -488,19 +440,10 @@
         </w:numPr>
       </w:pPr>
       <w:r>
-        <w:t xml:space="preserve">Users are to </w:t>
-      </w:r>
-      <w:r>
-        <w:t xml:space="preserve">have </w:t>
-      </w:r>
-      <w:r>
-        <w:t xml:space="preserve">stats </w:t>
-      </w:r>
-      <w:r>
-        <w:t xml:space="preserve">created </w:t>
-      </w:r>
-      <w:r>
-        <w:t>based on their spending.</w:t>
+        <w:t>Users are to have i</w:t>
+      </w:r>
+      <w:r>
+        <w:t>ncome &amp; spending forecast.</w:t>
       </w:r>
     </w:p>
     <w:p>
@@ -512,6 +455,48 @@
         </w:numPr>
       </w:pPr>
       <w:r>
+        <w:t xml:space="preserve">Users are to be sent </w:t>
+      </w:r>
+      <w:r>
+        <w:t>notifications</w:t>
+      </w:r>
+      <w:r>
+        <w:t xml:space="preserve"> if there is</w:t>
+      </w:r>
+      <w:r>
+        <w:t xml:space="preserve"> sudden spike in spendings.</w:t>
+      </w:r>
+    </w:p>
+    <w:p>
+      <w:pPr>
+        <w:pStyle w:val="ListParagraph"/>
+        <w:numPr>
+          <w:ilvl w:val="0"/>
+          <w:numId w:val="5"/>
+        </w:numPr>
+      </w:pPr>
+      <w:r>
+        <w:t xml:space="preserve">Users are to have </w:t>
+      </w:r>
+      <w:r>
+        <w:t xml:space="preserve">stats </w:t>
+      </w:r>
+      <w:r>
+        <w:t xml:space="preserve">created </w:t>
+      </w:r>
+      <w:r>
+        <w:t>based on their spending.</w:t>
+      </w:r>
+    </w:p>
+    <w:p>
+      <w:pPr>
+        <w:pStyle w:val="ListParagraph"/>
+        <w:numPr>
+          <w:ilvl w:val="0"/>
+          <w:numId w:val="5"/>
+        </w:numPr>
+      </w:pPr>
+      <w:r>
         <w:t>Users are to switch multiple themes set in the application</w:t>
       </w:r>
       <w:r>
@@ -519,7 +504,486 @@
       </w:r>
     </w:p>
     <w:p>
-      <w:r>
+      <w:pPr>
+        <w:pStyle w:val="Heading1"/>
+      </w:pPr>
+      <w:r>
+        <w:br w:type="page"/>
+      </w:r>
+      <w:r>
+        <w:lastRenderedPageBreak/>
+        <w:t>USE CASES</w:t>
+      </w:r>
+    </w:p>
+    <w:p>
+      <w:pPr>
+        <w:pStyle w:val="Heading2"/>
+        <w:numPr>
+          <w:ilvl w:val="0"/>
+          <w:numId w:val="8"/>
+        </w:numPr>
+      </w:pPr>
+      <w:r>
+        <w:t>User Signup:</w:t>
+      </w:r>
+    </w:p>
+    <w:p>
+      <w:r>
+        <w:t>The user will sign up by entering their email, username, password and initial fund</w:t>
+      </w:r>
+    </w:p>
+    <w:p>
+      <w:pPr>
+        <w:pStyle w:val="Heading2"/>
+        <w:numPr>
+          <w:ilvl w:val="0"/>
+          <w:numId w:val="8"/>
+        </w:numPr>
+      </w:pPr>
+      <w:r>
+        <w:t>User Makes A Payment</w:t>
+      </w:r>
+    </w:p>
+    <w:p>
+      <w:r>
+        <w:t>A modal will pop up and ask users to input a few things: transaction name, amount, datetime (default will be the exact moment the modal shows up), A list of merchant will be show up but if it is a new merchant who is not currently in the system then they will be created with the string they input. Once done, their net worth, liquidity, expense is reflected immediately</w:t>
+      </w:r>
+    </w:p>
+    <w:p>
+      <w:pPr>
+        <w:pStyle w:val="Heading2"/>
+        <w:numPr>
+          <w:ilvl w:val="0"/>
+          <w:numId w:val="8"/>
+        </w:numPr>
+      </w:pPr>
+      <w:r>
+        <w:t xml:space="preserve">User </w:t>
+      </w:r>
+      <w:r>
+        <w:t>Receives</w:t>
+      </w:r>
+      <w:r>
+        <w:t xml:space="preserve"> A Payment</w:t>
+      </w:r>
+    </w:p>
+    <w:p>
+      <w:r>
+        <w:t xml:space="preserve">A modal will pop up and ask users to input a few things: transaction name, amount, datetime (default will be the exact moment the modal shows up), A list of merchant will be show up but if it is a new merchant who is not currently in the system then they will be created with the string they input. Once done, their net worth, liquidity, </w:t>
+      </w:r>
+      <w:r>
+        <w:t>outgoing</w:t>
+      </w:r>
+      <w:r>
+        <w:t xml:space="preserve"> is reflected immediately</w:t>
+      </w:r>
+      <w:r>
+        <w:t>.</w:t>
+      </w:r>
+    </w:p>
+    <w:p>
+      <w:pPr>
+        <w:pStyle w:val="Heading2"/>
+        <w:numPr>
+          <w:ilvl w:val="0"/>
+          <w:numId w:val="8"/>
+        </w:numPr>
+      </w:pPr>
+      <w:r>
+        <w:t>User Gets Refunded For A Transaction</w:t>
+      </w:r>
+    </w:p>
+    <w:p>
+      <w:r>
+        <w:t xml:space="preserve">User finds the transaction and click on the 3 dots, an option will allow them to cancel the expense because say they return the item then the status will be shown as Cancelled. </w:t>
+      </w:r>
+      <w:r>
+        <w:t>Once done, their net worth, liquidity, outgoing is reflected immediately.</w:t>
+      </w:r>
+      <w:r>
+        <w:br w:type="page"/>
+      </w:r>
+    </w:p>
+    <w:p/>
+    <w:p/>
+    <w:p>
+      <w:pPr>
+        <w:pStyle w:val="Heading2"/>
+      </w:pPr>
+      <w:r>
+        <w:t>DATABASE DESIGN</w:t>
+      </w:r>
+    </w:p>
+    <w:p>
+      <w:pPr>
+        <w:jc w:val="center"/>
+      </w:pPr>
+      <w:r>
+        <w:t>Ver 1.0.0</w:t>
+      </w:r>
+    </w:p>
+    <w:p>
+      <w:r>
+        <w:rPr>
+          <w:noProof/>
+        </w:rPr>
+        <w:drawing>
+          <wp:inline distT="0" distB="0" distL="0" distR="0" wp14:anchorId="128BE1DD" wp14:editId="3495A3F4">
+            <wp:extent cx="5731510" cy="2574290"/>
+            <wp:effectExtent l="0" t="0" r="0" b="3810"/>
+            <wp:docPr id="1783564728" name="Picture 1"/>
+            <wp:cNvGraphicFramePr>
+              <a:graphicFrameLocks xmlns:a="http://schemas.openxmlformats.org/drawingml/2006/main" noChangeAspect="1"/>
+            </wp:cNvGraphicFramePr>
+            <a:graphic xmlns:a="http://schemas.openxmlformats.org/drawingml/2006/main">
+              <a:graphicData uri="http://schemas.openxmlformats.org/drawingml/2006/picture">
+                <pic:pic xmlns:pic="http://schemas.openxmlformats.org/drawingml/2006/picture">
+                  <pic:nvPicPr>
+                    <pic:cNvPr id="1783564728" name="Picture 1783564728"/>
+                    <pic:cNvPicPr/>
+                  </pic:nvPicPr>
+                  <pic:blipFill>
+                    <a:blip r:embed="rId6">
+                      <a:extLst>
+                        <a:ext uri="{28A0092B-C50C-407E-A947-70E740481C1C}">
+                          <a14:useLocalDpi xmlns:a14="http://schemas.microsoft.com/office/drawing/2010/main" val="0"/>
+                        </a:ext>
+                      </a:extLst>
+                    </a:blip>
+                    <a:stretch>
+                      <a:fillRect/>
+                    </a:stretch>
+                  </pic:blipFill>
+                  <pic:spPr>
+                    <a:xfrm>
+                      <a:off x="0" y="0"/>
+                      <a:ext cx="5731510" cy="2574290"/>
+                    </a:xfrm>
+                    <a:prstGeom prst="rect">
+                      <a:avLst/>
+                    </a:prstGeom>
+                  </pic:spPr>
+                </pic:pic>
+              </a:graphicData>
+            </a:graphic>
+          </wp:inline>
+        </w:drawing>
+      </w:r>
+    </w:p>
+    <w:p>
+      <w:pPr>
+        <w:rPr>
+          <w:b/>
+          <w:bCs/>
+        </w:rPr>
+      </w:pPr>
+      <w:r>
+        <w:rPr>
+          <w:b/>
+          <w:bCs/>
+        </w:rPr>
+        <w:t>FUNCTIONAL DEPENDENCY</w:t>
+      </w:r>
+      <w:r>
+        <w:rPr>
+          <w:b/>
+          <w:bCs/>
+        </w:rPr>
+        <w:t>:</w:t>
+      </w:r>
+    </w:p>
+    <w:p>
+      <w:pPr>
+        <w:pStyle w:val="ListParagraph"/>
+        <w:numPr>
+          <w:ilvl w:val="0"/>
+          <w:numId w:val="7"/>
+        </w:numPr>
+      </w:pPr>
+      <w:r>
+        <w:t xml:space="preserve">User -&gt; </w:t>
+      </w:r>
+      <w:r>
+        <w:rPr>
+          <w:u w:val="single"/>
+        </w:rPr>
+        <w:t>userid</w:t>
+      </w:r>
+      <w:r>
+        <w:t xml:space="preserve">, </w:t>
+      </w:r>
+      <w:r>
+        <w:t>username</w:t>
+      </w:r>
+      <w:r>
+        <w:t>, email, password</w:t>
+      </w:r>
+    </w:p>
+    <w:p>
+      <w:pPr>
+        <w:pStyle w:val="ListParagraph"/>
+        <w:numPr>
+          <w:ilvl w:val="0"/>
+          <w:numId w:val="7"/>
+        </w:numPr>
+      </w:pPr>
+      <w:r>
+        <w:t xml:space="preserve">Transaction -&gt; </w:t>
+      </w:r>
+      <w:r>
+        <w:rPr>
+          <w:u w:val="single"/>
+        </w:rPr>
+        <w:t>transaction_id</w:t>
+      </w:r>
+      <w:r>
+        <w:t xml:space="preserve">, </w:t>
+      </w:r>
+      <w:r>
+        <w:t>transaction_name</w:t>
+      </w:r>
+      <w:r>
+        <w:t>,</w:t>
+      </w:r>
+      <w:r>
+        <w:t xml:space="preserve"> transaction_amount,</w:t>
+      </w:r>
+      <w:r>
+        <w:t xml:space="preserve"> </w:t>
+      </w:r>
+      <w:r>
+        <w:t>transaction_status, transaction_datetime, merchant_id (FK)</w:t>
+      </w:r>
+      <w:r>
+        <w:t>,</w:t>
+      </w:r>
+      <w:r>
+        <w:t xml:space="preserve"> </w:t>
+      </w:r>
+      <w:r>
+        <w:t>c</w:t>
+      </w:r>
+      <w:r>
+        <w:t>ategory</w:t>
+      </w:r>
+      <w:r>
+        <w:t>_id (FK)</w:t>
+      </w:r>
+      <w:r>
+        <w:t xml:space="preserve">, </w:t>
+      </w:r>
+      <w:r>
+        <w:t>transaction_</w:t>
+      </w:r>
+      <w:r>
+        <w:t xml:space="preserve">status </w:t>
+      </w:r>
+      <w:r>
+        <w:rPr>
+          <w:rFonts w:ascii="Cambria Math" w:hAnsi="Cambria Math" w:cs="Cambria Math"/>
+        </w:rPr>
+        <w:t>∈</w:t>
+      </w:r>
+      <w:r>
+        <w:t xml:space="preserve"> </w:t>
+      </w:r>
+      <w:r>
+        <w:t>{</w:t>
+      </w:r>
+      <w:r>
+        <w:t>“pending”, ”Completed”, ”Failed”, ”Cancelled”</w:t>
+      </w:r>
+      <w:r>
+        <w:t>}</w:t>
+      </w:r>
+      <w:r>
+        <w:t xml:space="preserve">, </w:t>
+      </w:r>
+      <w:r>
+        <w:t>transaction_</w:t>
+      </w:r>
+      <w:r>
+        <w:t xml:space="preserve">type </w:t>
+      </w:r>
+      <w:r>
+        <w:rPr>
+          <w:rFonts w:ascii="Cambria Math" w:hAnsi="Cambria Math" w:cs="Cambria Math"/>
+        </w:rPr>
+        <w:t>∈</w:t>
+      </w:r>
+      <w:r>
+        <w:t xml:space="preserve"> </w:t>
+      </w:r>
+      <w:r>
+        <w:t>{“</w:t>
+      </w:r>
+      <w:r>
+        <w:t>I</w:t>
+      </w:r>
+      <w:r>
+        <w:t>ncoming</w:t>
+      </w:r>
+      <w:r>
+        <w:t>”</w:t>
+      </w:r>
+      <w:r>
+        <w:t xml:space="preserve">, </w:t>
+      </w:r>
+      <w:r>
+        <w:t>“</w:t>
+      </w:r>
+      <w:r>
+        <w:t>O</w:t>
+      </w:r>
+      <w:r>
+        <w:t>utgoing</w:t>
+      </w:r>
+      <w:r>
+        <w:t>”}</w:t>
+      </w:r>
+    </w:p>
+    <w:p>
+      <w:pPr>
+        <w:pStyle w:val="ListParagraph"/>
+        <w:numPr>
+          <w:ilvl w:val="0"/>
+          <w:numId w:val="7"/>
+        </w:numPr>
+      </w:pPr>
+      <w:r>
+        <w:t>Categor</w:t>
+      </w:r>
+      <w:r>
+        <w:t xml:space="preserve">y -&gt; </w:t>
+      </w:r>
+      <w:r>
+        <w:rPr>
+          <w:u w:val="single"/>
+        </w:rPr>
+        <w:t>category_id</w:t>
+      </w:r>
+      <w:r>
+        <w:t>, category_name</w:t>
+      </w:r>
+    </w:p>
+    <w:p>
+      <w:pPr>
+        <w:pStyle w:val="ListParagraph"/>
+        <w:numPr>
+          <w:ilvl w:val="0"/>
+          <w:numId w:val="7"/>
+        </w:numPr>
+      </w:pPr>
+      <w:r>
+        <w:t xml:space="preserve">Merchant -&gt; </w:t>
+      </w:r>
+      <w:r>
+        <w:rPr>
+          <w:u w:val="single"/>
+        </w:rPr>
+        <w:t>merchant_id</w:t>
+      </w:r>
+      <w:r>
+        <w:t>, merchant_name</w:t>
+      </w:r>
+    </w:p>
+    <w:p>
+      <w:pPr>
+        <w:pStyle w:val="ListParagraph"/>
+        <w:numPr>
+          <w:ilvl w:val="0"/>
+          <w:numId w:val="7"/>
+        </w:numPr>
+      </w:pPr>
+      <w:r>
+        <w:t xml:space="preserve">Asset -&gt; </w:t>
+      </w:r>
+      <w:r>
+        <w:rPr>
+          <w:u w:val="single"/>
+        </w:rPr>
+        <w:t>asset_id</w:t>
+      </w:r>
+      <w:r>
+        <w:t>, asset_name, asset_worth</w:t>
+      </w:r>
+    </w:p>
+    <w:p>
+      <w:pPr>
+        <w:pStyle w:val="ListParagraph"/>
+      </w:pPr>
+    </w:p>
+    <w:p>
+      <w:pPr>
+        <w:rPr>
+          <w:b/>
+          <w:bCs/>
+        </w:rPr>
+      </w:pPr>
+      <w:r>
+        <w:rPr>
+          <w:b/>
+          <w:bCs/>
+        </w:rPr>
+        <w:t>1NF: PASSED</w:t>
+      </w:r>
+    </w:p>
+    <w:p>
+      <w:pPr>
+        <w:rPr>
+          <w:b/>
+          <w:bCs/>
+        </w:rPr>
+      </w:pPr>
+      <w:r>
+        <w:rPr>
+          <w:b/>
+          <w:bCs/>
+        </w:rPr>
+        <w:t>2NF:</w:t>
+      </w:r>
+      <w:r>
+        <w:rPr>
+          <w:b/>
+          <w:bCs/>
+        </w:rPr>
+        <w:t xml:space="preserve"> PASSED</w:t>
+      </w:r>
+    </w:p>
+    <w:p>
+      <w:pPr>
+        <w:rPr>
+          <w:b/>
+          <w:bCs/>
+        </w:rPr>
+      </w:pPr>
+      <w:r>
+        <w:rPr>
+          <w:b/>
+          <w:bCs/>
+        </w:rPr>
+        <w:t>3NF: PASSED</w:t>
+      </w:r>
+    </w:p>
+    <w:p>
+      <w:pPr>
+        <w:rPr>
+          <w:b/>
+          <w:bCs/>
+        </w:rPr>
+      </w:pPr>
+      <w:r>
+        <w:rPr>
+          <w:b/>
+          <w:bCs/>
+        </w:rPr>
+        <w:tab/>
+      </w:r>
+      <w:r>
+        <w:rPr>
+          <w:b/>
+          <w:bCs/>
+        </w:rPr>
         <w:br w:type="page"/>
       </w:r>
     </w:p>
@@ -564,15 +1028,7 @@
         </w:rPr>
       </w:pPr>
       <w:r>
-        <w:t xml:space="preserve">The idea is I would create something simple first in plain HTML before migrating it to a component-based framework. At this point, I am not sure what tech stack should </w:t>
-      </w:r>
-      <w:proofErr w:type="spellStart"/>
-      <w:r>
-        <w:t>it</w:t>
-      </w:r>
-      <w:proofErr w:type="spellEnd"/>
-      <w:r>
-        <w:t xml:space="preserve"> be. Regardless, I </w:t>
+        <w:t xml:space="preserve">The idea is I would create something simple first in plain HTML before migrating it to a component-based framework. At this point, I am not sure what tech stack should it be. Regardless, I </w:t>
       </w:r>
       <w:r>
         <w:t>must</w:t>
@@ -683,6 +1139,95 @@
     </w:lvl>
   </w:abstractNum>
   <w:abstractNum w:abstractNumId="1" w15:restartNumberingAfterBreak="0">
+    <w:nsid w:val="0F7A63B2"/>
+    <w:multiLevelType w:val="hybridMultilevel"/>
+    <w:tmpl w:val="5FB8A808"/>
+    <w:lvl w:ilvl="0" w:tplc="0409000F">
+      <w:start w:val="1"/>
+      <w:numFmt w:val="decimal"/>
+      <w:lvlText w:val="%1."/>
+      <w:lvlJc w:val="left"/>
+      <w:pPr>
+        <w:ind w:left="720" w:hanging="360"/>
+      </w:pPr>
+      <w:rPr>
+        <w:rFonts w:hint="default"/>
+      </w:rPr>
+    </w:lvl>
+    <w:lvl w:ilvl="1" w:tplc="04090019" w:tentative="1">
+      <w:start w:val="1"/>
+      <w:numFmt w:val="lowerLetter"/>
+      <w:lvlText w:val="%2."/>
+      <w:lvlJc w:val="left"/>
+      <w:pPr>
+        <w:ind w:left="1440" w:hanging="360"/>
+      </w:pPr>
+    </w:lvl>
+    <w:lvl w:ilvl="2" w:tplc="0409001B" w:tentative="1">
+      <w:start w:val="1"/>
+      <w:numFmt w:val="lowerRoman"/>
+      <w:lvlText w:val="%3."/>
+      <w:lvlJc w:val="right"/>
+      <w:pPr>
+        <w:ind w:left="2160" w:hanging="180"/>
+      </w:pPr>
+    </w:lvl>
+    <w:lvl w:ilvl="3" w:tplc="0409000F" w:tentative="1">
+      <w:start w:val="1"/>
+      <w:numFmt w:val="decimal"/>
+      <w:lvlText w:val="%4."/>
+      <w:lvlJc w:val="left"/>
+      <w:pPr>
+        <w:ind w:left="2880" w:hanging="360"/>
+      </w:pPr>
+    </w:lvl>
+    <w:lvl w:ilvl="4" w:tplc="04090019" w:tentative="1">
+      <w:start w:val="1"/>
+      <w:numFmt w:val="lowerLetter"/>
+      <w:lvlText w:val="%5."/>
+      <w:lvlJc w:val="left"/>
+      <w:pPr>
+        <w:ind w:left="3600" w:hanging="360"/>
+      </w:pPr>
+    </w:lvl>
+    <w:lvl w:ilvl="5" w:tplc="0409001B" w:tentative="1">
+      <w:start w:val="1"/>
+      <w:numFmt w:val="lowerRoman"/>
+      <w:lvlText w:val="%6."/>
+      <w:lvlJc w:val="right"/>
+      <w:pPr>
+        <w:ind w:left="4320" w:hanging="180"/>
+      </w:pPr>
+    </w:lvl>
+    <w:lvl w:ilvl="6" w:tplc="0409000F" w:tentative="1">
+      <w:start w:val="1"/>
+      <w:numFmt w:val="decimal"/>
+      <w:lvlText w:val="%7."/>
+      <w:lvlJc w:val="left"/>
+      <w:pPr>
+        <w:ind w:left="5040" w:hanging="360"/>
+      </w:pPr>
+    </w:lvl>
+    <w:lvl w:ilvl="7" w:tplc="04090019" w:tentative="1">
+      <w:start w:val="1"/>
+      <w:numFmt w:val="lowerLetter"/>
+      <w:lvlText w:val="%8."/>
+      <w:lvlJc w:val="left"/>
+      <w:pPr>
+        <w:ind w:left="5760" w:hanging="360"/>
+      </w:pPr>
+    </w:lvl>
+    <w:lvl w:ilvl="8" w:tplc="0409001B" w:tentative="1">
+      <w:start w:val="1"/>
+      <w:numFmt w:val="lowerRoman"/>
+      <w:lvlText w:val="%9."/>
+      <w:lvlJc w:val="right"/>
+      <w:pPr>
+        <w:ind w:left="6480" w:hanging="180"/>
+      </w:pPr>
+    </w:lvl>
+  </w:abstractNum>
+  <w:abstractNum w:abstractNumId="2" w15:restartNumberingAfterBreak="0">
     <w:nsid w:val="3B986CED"/>
     <w:multiLevelType w:val="hybridMultilevel"/>
     <w:tmpl w:val="49B86C94"/>
@@ -771,7 +1316,7 @@
       </w:pPr>
     </w:lvl>
   </w:abstractNum>
-  <w:abstractNum w:abstractNumId="2" w15:restartNumberingAfterBreak="0">
+  <w:abstractNum w:abstractNumId="3" w15:restartNumberingAfterBreak="0">
     <w:nsid w:val="42D40E37"/>
     <w:multiLevelType w:val="hybridMultilevel"/>
     <w:tmpl w:val="CEB44570"/>
@@ -860,7 +1405,120 @@
       </w:pPr>
     </w:lvl>
   </w:abstractNum>
-  <w:abstractNum w:abstractNumId="3" w15:restartNumberingAfterBreak="0">
+  <w:abstractNum w:abstractNumId="4" w15:restartNumberingAfterBreak="0">
+    <w:nsid w:val="54017C20"/>
+    <w:multiLevelType w:val="hybridMultilevel"/>
+    <w:tmpl w:val="6E68F100"/>
+    <w:lvl w:ilvl="0" w:tplc="04090001">
+      <w:start w:val="1"/>
+      <w:numFmt w:val="bullet"/>
+      <w:lvlText w:val=""/>
+      <w:lvlJc w:val="left"/>
+      <w:pPr>
+        <w:ind w:left="720" w:hanging="360"/>
+      </w:pPr>
+      <w:rPr>
+        <w:rFonts w:ascii="Symbol" w:hAnsi="Symbol" w:hint="default"/>
+      </w:rPr>
+    </w:lvl>
+    <w:lvl w:ilvl="1" w:tplc="04090003" w:tentative="1">
+      <w:start w:val="1"/>
+      <w:numFmt w:val="bullet"/>
+      <w:lvlText w:val="o"/>
+      <w:lvlJc w:val="left"/>
+      <w:pPr>
+        <w:ind w:left="1440" w:hanging="360"/>
+      </w:pPr>
+      <w:rPr>
+        <w:rFonts w:ascii="Courier New" w:hAnsi="Courier New" w:hint="default"/>
+      </w:rPr>
+    </w:lvl>
+    <w:lvl w:ilvl="2" w:tplc="04090005" w:tentative="1">
+      <w:start w:val="1"/>
+      <w:numFmt w:val="bullet"/>
+      <w:lvlText w:val=""/>
+      <w:lvlJc w:val="left"/>
+      <w:pPr>
+        <w:ind w:left="2160" w:hanging="360"/>
+      </w:pPr>
+      <w:rPr>
+        <w:rFonts w:ascii="Wingdings" w:hAnsi="Wingdings" w:hint="default"/>
+      </w:rPr>
+    </w:lvl>
+    <w:lvl w:ilvl="3" w:tplc="04090001" w:tentative="1">
+      <w:start w:val="1"/>
+      <w:numFmt w:val="bullet"/>
+      <w:lvlText w:val=""/>
+      <w:lvlJc w:val="left"/>
+      <w:pPr>
+        <w:ind w:left="2880" w:hanging="360"/>
+      </w:pPr>
+      <w:rPr>
+        <w:rFonts w:ascii="Symbol" w:hAnsi="Symbol" w:hint="default"/>
+      </w:rPr>
+    </w:lvl>
+    <w:lvl w:ilvl="4" w:tplc="04090003" w:tentative="1">
+      <w:start w:val="1"/>
+      <w:numFmt w:val="bullet"/>
+      <w:lvlText w:val="o"/>
+      <w:lvlJc w:val="left"/>
+      <w:pPr>
+        <w:ind w:left="3600" w:hanging="360"/>
+      </w:pPr>
+      <w:rPr>
+        <w:rFonts w:ascii="Courier New" w:hAnsi="Courier New" w:hint="default"/>
+      </w:rPr>
+    </w:lvl>
+    <w:lvl w:ilvl="5" w:tplc="04090005" w:tentative="1">
+      <w:start w:val="1"/>
+      <w:numFmt w:val="bullet"/>
+      <w:lvlText w:val=""/>
+      <w:lvlJc w:val="left"/>
+      <w:pPr>
+        <w:ind w:left="4320" w:hanging="360"/>
+      </w:pPr>
+      <w:rPr>
+        <w:rFonts w:ascii="Wingdings" w:hAnsi="Wingdings" w:hint="default"/>
+      </w:rPr>
+    </w:lvl>
+    <w:lvl w:ilvl="6" w:tplc="04090001" w:tentative="1">
+      <w:start w:val="1"/>
+      <w:numFmt w:val="bullet"/>
+      <w:lvlText w:val=""/>
+      <w:lvlJc w:val="left"/>
+      <w:pPr>
+        <w:ind w:left="5040" w:hanging="360"/>
+      </w:pPr>
+      <w:rPr>
+        <w:rFonts w:ascii="Symbol" w:hAnsi="Symbol" w:hint="default"/>
+      </w:rPr>
+    </w:lvl>
+    <w:lvl w:ilvl="7" w:tplc="04090003" w:tentative="1">
+      <w:start w:val="1"/>
+      <w:numFmt w:val="bullet"/>
+      <w:lvlText w:val="o"/>
+      <w:lvlJc w:val="left"/>
+      <w:pPr>
+        <w:ind w:left="5760" w:hanging="360"/>
+      </w:pPr>
+      <w:rPr>
+        <w:rFonts w:ascii="Courier New" w:hAnsi="Courier New" w:hint="default"/>
+      </w:rPr>
+    </w:lvl>
+    <w:lvl w:ilvl="8" w:tplc="04090005" w:tentative="1">
+      <w:start w:val="1"/>
+      <w:numFmt w:val="bullet"/>
+      <w:lvlText w:val=""/>
+      <w:lvlJc w:val="left"/>
+      <w:pPr>
+        <w:ind w:left="6480" w:hanging="360"/>
+      </w:pPr>
+      <w:rPr>
+        <w:rFonts w:ascii="Wingdings" w:hAnsi="Wingdings" w:hint="default"/>
+      </w:rPr>
+    </w:lvl>
+  </w:abstractNum>
+  <w:abstractNum w:abstractNumId="5" w15:restartNumberingAfterBreak="0">
     <w:nsid w:val="5E5D5C2D"/>
     <w:multiLevelType w:val="hybridMultilevel"/>
     <w:tmpl w:val="98B6231A"/>
@@ -949,7 +1607,209 @@
       </w:pPr>
     </w:lvl>
   </w:abstractNum>
-  <w:abstractNum w:abstractNumId="4" w15:restartNumberingAfterBreak="0">
+  <w:abstractNum w:abstractNumId="6" w15:restartNumberingAfterBreak="0">
+    <w:nsid w:val="642B0991"/>
+    <w:multiLevelType w:val="hybridMultilevel"/>
+    <w:tmpl w:val="5FB8A808"/>
+    <w:lvl w:ilvl="0" w:tplc="FFFFFFFF">
+      <w:start w:val="1"/>
+      <w:numFmt w:val="decimal"/>
+      <w:lvlText w:val="%1."/>
+      <w:lvlJc w:val="left"/>
+      <w:pPr>
+        <w:ind w:left="720" w:hanging="360"/>
+      </w:pPr>
+      <w:rPr>
+        <w:rFonts w:hint="default"/>
+      </w:rPr>
+    </w:lvl>
+    <w:lvl w:ilvl="1" w:tplc="FFFFFFFF" w:tentative="1">
+      <w:start w:val="1"/>
+      <w:numFmt w:val="lowerLetter"/>
+      <w:lvlText w:val="%2."/>
+      <w:lvlJc w:val="left"/>
+      <w:pPr>
+        <w:ind w:left="1440" w:hanging="360"/>
+      </w:pPr>
+    </w:lvl>
+    <w:lvl w:ilvl="2" w:tplc="FFFFFFFF" w:tentative="1">
+      <w:start w:val="1"/>
+      <w:numFmt w:val="lowerRoman"/>
+      <w:lvlText w:val="%3."/>
+      <w:lvlJc w:val="right"/>
+      <w:pPr>
+        <w:ind w:left="2160" w:hanging="180"/>
+      </w:pPr>
+    </w:lvl>
+    <w:lvl w:ilvl="3" w:tplc="FFFFFFFF" w:tentative="1">
+      <w:start w:val="1"/>
+      <w:numFmt w:val="decimal"/>
+      <w:lvlText w:val="%4."/>
+      <w:lvlJc w:val="left"/>
+      <w:pPr>
+        <w:ind w:left="2880" w:hanging="360"/>
+      </w:pPr>
+    </w:lvl>
+    <w:lvl w:ilvl="4" w:tplc="FFFFFFFF" w:tentative="1">
+      <w:start w:val="1"/>
+      <w:numFmt w:val="lowerLetter"/>
+      <w:lvlText w:val="%5."/>
+      <w:lvlJc w:val="left"/>
+      <w:pPr>
+        <w:ind w:left="3600" w:hanging="360"/>
+      </w:pPr>
+    </w:lvl>
+    <w:lvl w:ilvl="5" w:tplc="FFFFFFFF" w:tentative="1">
+      <w:start w:val="1"/>
+      <w:numFmt w:val="lowerRoman"/>
+      <w:lvlText w:val="%6."/>
+      <w:lvlJc w:val="right"/>
+      <w:pPr>
+        <w:ind w:left="4320" w:hanging="180"/>
+      </w:pPr>
+    </w:lvl>
+    <w:lvl w:ilvl="6" w:tplc="FFFFFFFF" w:tentative="1">
+      <w:start w:val="1"/>
+      <w:numFmt w:val="decimal"/>
+      <w:lvlText w:val="%7."/>
+      <w:lvlJc w:val="left"/>
+      <w:pPr>
+        <w:ind w:left="5040" w:hanging="360"/>
+      </w:pPr>
+    </w:lvl>
+    <w:lvl w:ilvl="7" w:tplc="FFFFFFFF" w:tentative="1">
+      <w:start w:val="1"/>
+      <w:numFmt w:val="lowerLetter"/>
+      <w:lvlText w:val="%8."/>
+      <w:lvlJc w:val="left"/>
+      <w:pPr>
+        <w:ind w:left="5760" w:hanging="360"/>
+      </w:pPr>
+    </w:lvl>
+    <w:lvl w:ilvl="8" w:tplc="FFFFFFFF" w:tentative="1">
+      <w:start w:val="1"/>
+      <w:numFmt w:val="lowerRoman"/>
+      <w:lvlText w:val="%9."/>
+      <w:lvlJc w:val="right"/>
+      <w:pPr>
+        <w:ind w:left="6480" w:hanging="180"/>
+      </w:pPr>
+    </w:lvl>
+  </w:abstractNum>
+  <w:abstractNum w:abstractNumId="7" w15:restartNumberingAfterBreak="0">
+    <w:nsid w:val="6C316E86"/>
+    <w:multiLevelType w:val="hybridMultilevel"/>
+    <w:tmpl w:val="8CE477B4"/>
+    <w:lvl w:ilvl="0" w:tplc="04090005">
+      <w:start w:val="1"/>
+      <w:numFmt w:val="bullet"/>
+      <w:lvlText w:val=""/>
+      <w:lvlJc w:val="left"/>
+      <w:pPr>
+        <w:ind w:left="720" w:hanging="360"/>
+      </w:pPr>
+      <w:rPr>
+        <w:rFonts w:ascii="Wingdings" w:hAnsi="Wingdings" w:hint="default"/>
+      </w:rPr>
+    </w:lvl>
+    <w:lvl w:ilvl="1" w:tplc="FFFFFFFF" w:tentative="1">
+      <w:start w:val="1"/>
+      <w:numFmt w:val="bullet"/>
+      <w:lvlText w:val="o"/>
+      <w:lvlJc w:val="left"/>
+      <w:pPr>
+        <w:ind w:left="1440" w:hanging="360"/>
+      </w:pPr>
+      <w:rPr>
+        <w:rFonts w:ascii="Courier New" w:hAnsi="Courier New" w:hint="default"/>
+      </w:rPr>
+    </w:lvl>
+    <w:lvl w:ilvl="2" w:tplc="FFFFFFFF" w:tentative="1">
+      <w:start w:val="1"/>
+      <w:numFmt w:val="bullet"/>
+      <w:lvlText w:val=""/>
+      <w:lvlJc w:val="left"/>
+      <w:pPr>
+        <w:ind w:left="2160" w:hanging="360"/>
+      </w:pPr>
+      <w:rPr>
+        <w:rFonts w:ascii="Wingdings" w:hAnsi="Wingdings" w:hint="default"/>
+      </w:rPr>
+    </w:lvl>
+    <w:lvl w:ilvl="3" w:tplc="FFFFFFFF" w:tentative="1">
+      <w:start w:val="1"/>
+      <w:numFmt w:val="bullet"/>
+      <w:lvlText w:val=""/>
+      <w:lvlJc w:val="left"/>
+      <w:pPr>
+        <w:ind w:left="2880" w:hanging="360"/>
+      </w:pPr>
+      <w:rPr>
+        <w:rFonts w:ascii="Symbol" w:hAnsi="Symbol" w:hint="default"/>
+      </w:rPr>
+    </w:lvl>
+    <w:lvl w:ilvl="4" w:tplc="FFFFFFFF" w:tentative="1">
+      <w:start w:val="1"/>
+      <w:numFmt w:val="bullet"/>
+      <w:lvlText w:val="o"/>
+      <w:lvlJc w:val="left"/>
+      <w:pPr>
+        <w:ind w:left="3600" w:hanging="360"/>
+      </w:pPr>
+      <w:rPr>
+        <w:rFonts w:ascii="Courier New" w:hAnsi="Courier New" w:hint="default"/>
+      </w:rPr>
+    </w:lvl>
+    <w:lvl w:ilvl="5" w:tplc="FFFFFFFF" w:tentative="1">
+      <w:start w:val="1"/>
+      <w:numFmt w:val="bullet"/>
+      <w:lvlText w:val=""/>
+      <w:lvlJc w:val="left"/>
+      <w:pPr>
+        <w:ind w:left="4320" w:hanging="360"/>
+      </w:pPr>
+      <w:rPr>
+        <w:rFonts w:ascii="Wingdings" w:hAnsi="Wingdings" w:hint="default"/>
+      </w:rPr>
+    </w:lvl>
+    <w:lvl w:ilvl="6" w:tplc="FFFFFFFF" w:tentative="1">
+      <w:start w:val="1"/>
+      <w:numFmt w:val="bullet"/>
+      <w:lvlText w:val=""/>
+      <w:lvlJc w:val="left"/>
+      <w:pPr>
+        <w:ind w:left="5040" w:hanging="360"/>
+      </w:pPr>
+      <w:rPr>
+        <w:rFonts w:ascii="Symbol" w:hAnsi="Symbol" w:hint="default"/>
+      </w:rPr>
+    </w:lvl>
+    <w:lvl w:ilvl="7" w:tplc="FFFFFFFF" w:tentative="1">
+      <w:start w:val="1"/>
+      <w:numFmt w:val="bullet"/>
+      <w:lvlText w:val="o"/>
+      <w:lvlJc w:val="left"/>
+      <w:pPr>
+        <w:ind w:left="5760" w:hanging="360"/>
+      </w:pPr>
+      <w:rPr>
+        <w:rFonts w:ascii="Courier New" w:hAnsi="Courier New" w:hint="default"/>
+      </w:rPr>
+    </w:lvl>
+    <w:lvl w:ilvl="8" w:tplc="FFFFFFFF" w:tentative="1">
+      <w:start w:val="1"/>
+      <w:numFmt w:val="bullet"/>
+      <w:lvlText w:val=""/>
+      <w:lvlJc w:val="left"/>
+      <w:pPr>
+        <w:ind w:left="6480" w:hanging="360"/>
+      </w:pPr>
+      <w:rPr>
+        <w:rFonts w:ascii="Wingdings" w:hAnsi="Wingdings" w:hint="default"/>
+      </w:rPr>
+    </w:lvl>
+  </w:abstractNum>
+  <w:abstractNum w:abstractNumId="8" w15:restartNumberingAfterBreak="0">
     <w:nsid w:val="79AD281C"/>
     <w:multiLevelType w:val="hybridMultilevel"/>
     <w:tmpl w:val="F790F7C2"/>
@@ -1042,16 +1902,28 @@
     <w:abstractNumId w:val="0"/>
   </w:num>
   <w:num w:numId="2" w16cid:durableId="1015036866">
+    <w:abstractNumId w:val="2"/>
+  </w:num>
+  <w:num w:numId="3" w16cid:durableId="604383128">
+    <w:abstractNumId w:val="8"/>
+  </w:num>
+  <w:num w:numId="4" w16cid:durableId="1929731843">
+    <w:abstractNumId w:val="5"/>
+  </w:num>
+  <w:num w:numId="5" w16cid:durableId="1703246031">
+    <w:abstractNumId w:val="3"/>
+  </w:num>
+  <w:num w:numId="6" w16cid:durableId="1103569093">
+    <w:abstractNumId w:val="4"/>
+  </w:num>
+  <w:num w:numId="7" w16cid:durableId="1741977542">
+    <w:abstractNumId w:val="7"/>
+  </w:num>
+  <w:num w:numId="8" w16cid:durableId="1235042806">
     <w:abstractNumId w:val="1"/>
   </w:num>
-  <w:num w:numId="3" w16cid:durableId="604383128">
-    <w:abstractNumId w:val="4"/>
-  </w:num>
-  <w:num w:numId="4" w16cid:durableId="1929731843">
-    <w:abstractNumId w:val="3"/>
-  </w:num>
-  <w:num w:numId="5" w16cid:durableId="1703246031">
-    <w:abstractNumId w:val="2"/>
+  <w:num w:numId="9" w16cid:durableId="1114979391">
+    <w:abstractNumId w:val="6"/>
   </w:num>
 </w:numbering>
 </file>
@@ -1484,7 +2356,6 @@
     <w:next w:val="Normal"/>
     <w:link w:val="Heading2Char"/>
     <w:uiPriority w:val="9"/>
-    <w:semiHidden/>
     <w:unhideWhenUsed/>
     <w:qFormat/>
     <w:rsid w:val="00F9719F"/>
@@ -1507,7 +2378,6 @@
     <w:next w:val="Normal"/>
     <w:link w:val="Heading3Char"/>
     <w:uiPriority w:val="9"/>
-    <w:semiHidden/>
     <w:unhideWhenUsed/>
     <w:qFormat/>
     <w:rsid w:val="00F9719F"/>
@@ -1701,7 +2571,6 @@
     <w:basedOn w:val="DefaultParagraphFont"/>
     <w:link w:val="Heading2"/>
     <w:uiPriority w:val="9"/>
-    <w:semiHidden/>
     <w:rsid w:val="00F9719F"/>
     <w:rPr>
       <w:rFonts w:asciiTheme="majorHAnsi" w:eastAsiaTheme="majorEastAsia" w:hAnsiTheme="majorHAnsi" w:cstheme="majorBidi"/>
@@ -1715,7 +2584,6 @@
     <w:basedOn w:val="DefaultParagraphFont"/>
     <w:link w:val="Heading3"/>
     <w:uiPriority w:val="9"/>
-    <w:semiHidden/>
     <w:rsid w:val="00F9719F"/>
     <w:rPr>
       <w:rFonts w:eastAsiaTheme="majorEastAsia" w:cstheme="majorBidi"/>

</xml_diff>